<commit_message>
Actualizar laboratorio de presion y habilitar clase 08
</commit_message>
<xml_diff>
--- a/Segundo Corte/09 Clase/Lab_Presion_Galga.docx
+++ b/Segundo Corte/09 Clase/Lab_Presion_Galga.docx
@@ -1642,7 +1642,14 @@
           <w:b w:val="0"/>
           <w:color w:val="0070C0"/>
         </w:rPr>
-        <w:t>PRESIÓN PLANTAR BASADO EN GALGA EXTENCIOMÉTRICA</w:t>
+        <w:t>BÁSCULA</w:t>
+      </w:r>
+      <w:r>
+        <w:rPr>
+          <w:b w:val="0"/>
+          <w:color w:val="0070C0"/>
+        </w:rPr>
+        <w:t xml:space="preserve"> BASADO EN GALGA EXTENCIOMÉTRICA</w:t>
       </w:r>
     </w:p>
     <w:p>
@@ -1922,15 +1929,23 @@
           <w:sz w:val="22"/>
           <w:szCs w:val="22"/>
         </w:rPr>
-        <w:t>El sistema sea capaz de captar, medir y determinar un valor acorde cada una de las señales eléctricas que se generan cada una de las regiones del pie</w:t>
-      </w:r>
-      <w:r>
-        <w:rPr>
-          <w:rFonts w:asciiTheme="minorHAnsi" w:hAnsiTheme="minorHAnsi"/>
-          <w:sz w:val="22"/>
-          <w:szCs w:val="22"/>
-        </w:rPr>
-        <w:t xml:space="preserve"> u otra aplicación que ustedes como grupo quieran abordar.</w:t>
+        <w:t xml:space="preserve">El sistema sea capaz de captar, medir y determinar un valor acorde cada una de las señales eléctricas que se generan cada una de las regiones </w:t>
+      </w:r>
+      <w:r>
+        <w:rPr>
+          <w:rFonts w:asciiTheme="minorHAnsi" w:hAnsiTheme="minorHAnsi"/>
+          <w:sz w:val="22"/>
+          <w:szCs w:val="22"/>
+        </w:rPr>
+        <w:t xml:space="preserve">de una báscula </w:t>
+      </w:r>
+      <w:r>
+        <w:rPr>
+          <w:rFonts w:asciiTheme="minorHAnsi" w:hAnsiTheme="minorHAnsi"/>
+          <w:sz w:val="22"/>
+          <w:szCs w:val="22"/>
+        </w:rPr>
+        <w:t>u otra aplicación que ustedes como grupo quieran abordar.</w:t>
       </w:r>
     </w:p>
     <w:p>
@@ -2194,15 +2209,31 @@
           <w:sz w:val="22"/>
           <w:szCs w:val="22"/>
         </w:rPr>
-        <w:t>Conocer el estado del arte (dispositivos para la medición de la presión plantar</w:t>
-      </w:r>
-      <w:r>
-        <w:rPr>
-          <w:rFonts w:asciiTheme="minorHAnsi" w:hAnsiTheme="minorHAnsi"/>
-          <w:sz w:val="22"/>
-          <w:szCs w:val="22"/>
-        </w:rPr>
-        <w:t xml:space="preserve"> y/o escenario aplicado</w:t>
+        <w:t xml:space="preserve">Conocer el estado del arte (dispositivos para la medición </w:t>
+      </w:r>
+      <w:r>
+        <w:rPr>
+          <w:rFonts w:asciiTheme="minorHAnsi" w:hAnsiTheme="minorHAnsi"/>
+          <w:sz w:val="22"/>
+          <w:szCs w:val="22"/>
+        </w:rPr>
+        <w:t>del peso</w:t>
+      </w:r>
+      <w:r>
+        <w:rPr>
+          <w:rFonts w:asciiTheme="minorHAnsi" w:hAnsiTheme="minorHAnsi"/>
+          <w:sz w:val="22"/>
+          <w:szCs w:val="22"/>
+        </w:rPr>
+        <w:t xml:space="preserve"> y/o </w:t>
+      </w:r>
+      <w:r>
+        <w:rPr>
+          <w:rFonts w:asciiTheme="minorHAnsi" w:hAnsiTheme="minorHAnsi"/>
+          <w:sz w:val="22"/>
+          <w:szCs w:val="22"/>
+        </w:rPr>
+        <w:t>problema abordado</w:t>
       </w:r>
       <w:r>
         <w:rPr>
@@ -2241,15 +2272,39 @@
           <w:sz w:val="22"/>
           <w:szCs w:val="22"/>
         </w:rPr>
-        <w:t>Estudiar la anatomía del pie profundizando sus principales características</w:t>
-      </w:r>
-      <w:r>
-        <w:rPr>
-          <w:rFonts w:asciiTheme="minorHAnsi" w:hAnsiTheme="minorHAnsi"/>
-          <w:sz w:val="22"/>
-          <w:szCs w:val="22"/>
-        </w:rPr>
-        <w:t xml:space="preserve"> o en dado caso sobre el reto a abordar</w:t>
+        <w:t xml:space="preserve">Estudiar la </w:t>
+      </w:r>
+      <w:r>
+        <w:rPr>
+          <w:rFonts w:asciiTheme="minorHAnsi" w:hAnsiTheme="minorHAnsi"/>
+          <w:sz w:val="22"/>
+          <w:szCs w:val="22"/>
+        </w:rPr>
+        <w:t xml:space="preserve">estructura del dispositivo a abordar </w:t>
+      </w:r>
+      <w:r>
+        <w:rPr>
+          <w:rFonts w:asciiTheme="minorHAnsi" w:hAnsiTheme="minorHAnsi"/>
+          <w:sz w:val="22"/>
+          <w:szCs w:val="22"/>
+        </w:rPr>
+        <w:t>profundizando sus principales características</w:t>
+      </w:r>
+      <w:r>
+        <w:rPr>
+          <w:rFonts w:asciiTheme="minorHAnsi" w:hAnsiTheme="minorHAnsi"/>
+          <w:sz w:val="22"/>
+          <w:szCs w:val="22"/>
+        </w:rPr>
+        <w:t xml:space="preserve"> o en dado caso sobre el reto a </w:t>
+      </w:r>
+      <w:r>
+        <w:rPr>
+          <w:rFonts w:asciiTheme="minorHAnsi" w:hAnsiTheme="minorHAnsi"/>
+          <w:sz w:val="22"/>
+          <w:szCs w:val="22"/>
+        </w:rPr>
+        <w:t>trabajar</w:t>
       </w:r>
       <w:r>
         <w:rPr>
@@ -9152,15 +9207,18 @@
 </file>
 
 <file path=customXml/item1.xml><?xml version="1.0" encoding="utf-8"?>
-<?mso-contentType ?>
-<FormTemplates xmlns="http://schemas.microsoft.com/sharepoint/v3/contenttype/forms">
-  <Display>DocumentLibraryForm</Display>
-  <Edit>DocumentLibraryForm</Edit>
-  <New>DocumentLibraryForm</New>
-</FormTemplates>
+<p:properties xmlns:p="http://schemas.microsoft.com/office/2006/metadata/properties" xmlns:xsi="http://www.w3.org/2001/XMLSchema-instance" xmlns:pc="http://schemas.microsoft.com/office/infopath/2007/PartnerControls">
+  <documentManagement>
+    <_activity xmlns="c0c46fdd-2a6c-49f1-bb4d-a6e06b52ee64" xsi:nil="true"/>
+  </documentManagement>
+</p:properties>
 </file>
 
 <file path=customXml/item2.xml><?xml version="1.0" encoding="utf-8"?>
+<b:Sources xmlns:b="http://schemas.openxmlformats.org/officeDocument/2006/bibliography" xmlns="http://schemas.openxmlformats.org/officeDocument/2006/bibliography" SelectedStyle="\APA.XSL" StyleName="APA"/>
+</file>
+
+<file path=customXml/item3.xml><?xml version="1.0" encoding="utf-8"?>
 <ct:contentTypeSchema xmlns:ct="http://schemas.microsoft.com/office/2006/metadata/contentType" xmlns:ma="http://schemas.microsoft.com/office/2006/metadata/properties/metaAttributes" ct:_="" ma:_="" ma:contentTypeName="Document" ma:contentTypeID="0x01010092900F3A557F714198AE6C43099F60F5" ma:contentTypeVersion="14" ma:contentTypeDescription="Create a new document." ma:contentTypeScope="" ma:versionID="524df1743bab3cb4cff3aba33e6f846e">
   <xsd:schema xmlns:xsd="http://www.w3.org/2001/XMLSchema" xmlns:xs="http://www.w3.org/2001/XMLSchema" xmlns:p="http://schemas.microsoft.com/office/2006/metadata/properties" xmlns:ns3="c0c46fdd-2a6c-49f1-bb4d-a6e06b52ee64" xmlns:ns4="39f50d38-4380-46af-a5b6-6da54e8ee224" targetNamespace="http://schemas.microsoft.com/office/2006/metadata/properties" ma:root="true" ma:fieldsID="0804cfe1896ac6b120bbf000a076f76f" ns3:_="" ns4:_="">
     <xsd:import namespace="c0c46fdd-2a6c-49f1-bb4d-a6e06b52ee64"/>
@@ -9387,27 +9445,34 @@
 </ct:contentTypeSchema>
 </file>
 
-<file path=customXml/item3.xml><?xml version="1.0" encoding="utf-8"?>
-<b:Sources xmlns:b="http://schemas.openxmlformats.org/officeDocument/2006/bibliography" xmlns="http://schemas.openxmlformats.org/officeDocument/2006/bibliography" SelectedStyle="\APA.XSL" StyleName="APA"/>
-</file>
-
 <file path=customXml/item4.xml><?xml version="1.0" encoding="utf-8"?>
-<p:properties xmlns:p="http://schemas.microsoft.com/office/2006/metadata/properties" xmlns:xsi="http://www.w3.org/2001/XMLSchema-instance" xmlns:pc="http://schemas.microsoft.com/office/infopath/2007/PartnerControls">
-  <documentManagement>
-    <_activity xmlns="c0c46fdd-2a6c-49f1-bb4d-a6e06b52ee64" xsi:nil="true"/>
-  </documentManagement>
-</p:properties>
+<?mso-contentType ?>
+<FormTemplates xmlns="http://schemas.microsoft.com/sharepoint/v3/contenttype/forms">
+  <Display>DocumentLibraryForm</Display>
+  <Edit>DocumentLibraryForm</Edit>
+  <New>DocumentLibraryForm</New>
+</FormTemplates>
 </file>
 
 <file path=customXml/itemProps1.xml><?xml version="1.0" encoding="utf-8"?>
-<ds:datastoreItem xmlns:ds="http://schemas.openxmlformats.org/officeDocument/2006/customXml" ds:itemID="{A97F8998-3AF5-4495-8A21-DC6596BC0765}">
+<ds:datastoreItem xmlns:ds="http://schemas.openxmlformats.org/officeDocument/2006/customXml" ds:itemID="{386C223F-D79E-4714-A97D-EB5C7124395A}">
   <ds:schemaRefs>
-    <ds:schemaRef ds:uri="http://schemas.microsoft.com/sharepoint/v3/contenttype/forms"/>
+    <ds:schemaRef ds:uri="http://schemas.microsoft.com/office/2006/metadata/properties"/>
+    <ds:schemaRef ds:uri="http://schemas.microsoft.com/office/infopath/2007/PartnerControls"/>
+    <ds:schemaRef ds:uri="c0c46fdd-2a6c-49f1-bb4d-a6e06b52ee64"/>
   </ds:schemaRefs>
 </ds:datastoreItem>
 </file>
 
 <file path=customXml/itemProps2.xml><?xml version="1.0" encoding="utf-8"?>
+<ds:datastoreItem xmlns:ds="http://schemas.openxmlformats.org/officeDocument/2006/customXml" ds:itemID="{D863128E-7B93-4ECC-A846-F61B28FFC497}">
+  <ds:schemaRefs>
+    <ds:schemaRef ds:uri="http://schemas.openxmlformats.org/officeDocument/2006/bibliography"/>
+  </ds:schemaRefs>
+</ds:datastoreItem>
+</file>
+
+<file path=customXml/itemProps3.xml><?xml version="1.0" encoding="utf-8"?>
 <ds:datastoreItem xmlns:ds="http://schemas.openxmlformats.org/officeDocument/2006/customXml" ds:itemID="{5A48EDDA-9E69-4D6A-AA28-A0E54238D3D8}">
   <ds:schemaRefs>
     <ds:schemaRef ds:uri="http://schemas.microsoft.com/office/2006/metadata/contentType"/>
@@ -9426,20 +9491,10 @@
 </ds:datastoreItem>
 </file>
 
-<file path=customXml/itemProps3.xml><?xml version="1.0" encoding="utf-8"?>
-<ds:datastoreItem xmlns:ds="http://schemas.openxmlformats.org/officeDocument/2006/customXml" ds:itemID="{D863128E-7B93-4ECC-A846-F61B28FFC497}">
+<file path=customXml/itemProps4.xml><?xml version="1.0" encoding="utf-8"?>
+<ds:datastoreItem xmlns:ds="http://schemas.openxmlformats.org/officeDocument/2006/customXml" ds:itemID="{A97F8998-3AF5-4495-8A21-DC6596BC0765}">
   <ds:schemaRefs>
-    <ds:schemaRef ds:uri="http://schemas.openxmlformats.org/officeDocument/2006/bibliography"/>
-  </ds:schemaRefs>
-</ds:datastoreItem>
-</file>
-
-<file path=customXml/itemProps4.xml><?xml version="1.0" encoding="utf-8"?>
-<ds:datastoreItem xmlns:ds="http://schemas.openxmlformats.org/officeDocument/2006/customXml" ds:itemID="{386C223F-D79E-4714-A97D-EB5C7124395A}">
-  <ds:schemaRefs>
-    <ds:schemaRef ds:uri="http://schemas.microsoft.com/office/2006/metadata/properties"/>
-    <ds:schemaRef ds:uri="http://schemas.microsoft.com/office/infopath/2007/PartnerControls"/>
-    <ds:schemaRef ds:uri="c0c46fdd-2a6c-49f1-bb4d-a6e06b52ee64"/>
+    <ds:schemaRef ds:uri="http://schemas.microsoft.com/sharepoint/v3/contenttype/forms"/>
   </ds:schemaRefs>
 </ds:datastoreItem>
 </file>
</xml_diff>